<commit_message>
feat: add separate remote AXI slave regions
</commit_message>
<xml_diff>
--- a/docs/floo_2x2_full_integration/HAMSA_FlooNoC_Full_Integration_Report.docx
+++ b/docs/floo_2x2_full_integration/HAMSA_FlooNoC_Full_Integration_Report.docx
@@ -30,17 +30,17 @@
     </w:p>
     <w:p>
       <w:r>
-        <w:t xml:space="preserve">This work integrates FlooNoC into the HAMSA/PULPenix SoC by routing HAMSA's external AXI path (`xtrn`, exposed through `masters[4]` / `slaves[4]`) through a Floo AXI Chimney and Router. The final demo proves a full end-to-end transaction: HAMSA-side AXI traffic is converted into Floo flits, routed to a remote NoC-side endpoint, converted back to AXI, written into a selectable remote AXI RAM bank, read back, and checked for correctness.</w:t>
-      </w:r>
-    </w:p>
-    <w:p>
-      <w:r>
-        <w:t xml:space="preserve"/>
-      </w:r>
-    </w:p>
-    <w:p>
-      <w:r>
-        <w:t xml:space="preserve">The latest proof is stronger than the original single-register demo. The remote endpoint now contains four independent 256-word RAM banks, and the testbench can select which RAM bank and which words to access using plusargs.</w:t>
+        <w:t xml:space="preserve">This work integrates FlooNoC into the HAMSA/PULPenix SoC by routing HAMSA's external AXI path (`xtrn`, exposed through `masters[4]` / `slaves[4]`) through a Floo AXI Chimney and Router. The final demo proves a full end-to-end transaction: HAMSA-side AXI traffic is converted into Floo flits, routed to a remote NoC-side endpoint, converted back to AXI, written into a selectable remote AXI slave region, read back, and checked for correctness.</w:t>
+      </w:r>
+    </w:p>
+    <w:p>
+      <w:r>
+        <w:t xml:space="preserve"/>
+      </w:r>
+    </w:p>
+    <w:p>
+      <w:r>
+        <w:t xml:space="preserve">The latest branch is stronger than the equal-bank demo. The remote endpoint now exposes three different memory-mapped AXI slave regions: a small fast register file, a medium RAM, and a large RAM. The testbench can select which slave region and which words to access using plusargs.</w:t>
       </w:r>
     </w:p>
     <w:p>
@@ -67,7 +67,7 @@
           <w:rFonts w:ascii="Courier New" w:hAnsi="Courier New"/>
           <w:sz w:val="18"/>
         </w:rPr>
-        <w:t xml:space="preserve">[FLOO_2X2] PASS: 4/4 remote RAM readbacks matched</w:t>
+        <w:t xml:space="preserve">[FLOO_2X2] PASS: 4/4 remote slave readbacks matched</w:t>
       </w:r>
     </w:p>
     <w:p>
@@ -374,7 +374,7 @@
           <w:rFonts w:ascii="Courier New" w:hAnsi="Courier New"/>
           <w:sz w:val="18"/>
         </w:rPr>
-        <w:t xml:space="preserve">              Remote Floo AXI RAM Endpoint</w:t>
+        <w:t xml:space="preserve">              Remote Floo AXI Slave Endpoint</w:t>
       </w:r>
     </w:p>
     <w:p>
@@ -434,43 +434,31 @@
           <w:rFonts w:ascii="Courier New" w:hAnsi="Courier New"/>
           <w:sz w:val="18"/>
         </w:rPr>
-        <w:t xml:space="preserve">             | RAM bank 0: 256 x 32-bit    |</w:t>
-      </w:r>
-    </w:p>
-    <w:p>
-      <w:pPr>
-        <w:pStyle w:val="Code"/>
-      </w:pPr>
-      <w:r>
-        <w:rPr>
-          <w:rFonts w:ascii="Courier New" w:hAnsi="Courier New"/>
-          <w:sz w:val="18"/>
-        </w:rPr>
-        <w:t xml:space="preserve">             | RAM bank 1: 256 x 32-bit    |</w:t>
-      </w:r>
-    </w:p>
-    <w:p>
-      <w:pPr>
-        <w:pStyle w:val="Code"/>
-      </w:pPr>
-      <w:r>
-        <w:rPr>
-          <w:rFonts w:ascii="Courier New" w:hAnsi="Courier New"/>
-          <w:sz w:val="18"/>
-        </w:rPr>
-        <w:t xml:space="preserve">             | RAM bank 2: 256 x 32-bit    |</w:t>
-      </w:r>
-    </w:p>
-    <w:p>
-      <w:pPr>
-        <w:pStyle w:val="Code"/>
-      </w:pPr>
-      <w:r>
-        <w:rPr>
-          <w:rFonts w:ascii="Courier New" w:hAnsi="Courier New"/>
-          <w:sz w:val="18"/>
-        </w:rPr>
-        <w:t xml:space="preserve">             | RAM bank 3: 256 x 32-bit    |</w:t>
+        <w:t xml:space="preserve">             | small reg: 16 x 32-bit      |</w:t>
+      </w:r>
+    </w:p>
+    <w:p>
+      <w:pPr>
+        <w:pStyle w:val="Code"/>
+      </w:pPr>
+      <w:r>
+        <w:rPr>
+          <w:rFonts w:ascii="Courier New" w:hAnsi="Courier New"/>
+          <w:sz w:val="18"/>
+        </w:rPr>
+        <w:t xml:space="preserve">             | medium RAM: 256 x 32-bit    |</w:t>
+      </w:r>
+    </w:p>
+    <w:p>
+      <w:pPr>
+        <w:pStyle w:val="Code"/>
+      </w:pPr>
+      <w:r>
+        <w:rPr>
+          <w:rFonts w:ascii="Courier New" w:hAnsi="Courier New"/>
+          <w:sz w:val="18"/>
+        </w:rPr>
+        <w:t xml:space="preserve">             | large RAM: 1024 x 32-bit    |</w:t>
       </w:r>
     </w:p>
     <w:p>
@@ -668,7 +656,19 @@
           <w:rFonts w:ascii="Courier New" w:hAnsi="Courier New"/>
           <w:sz w:val="18"/>
         </w:rPr>
-        <w:t xml:space="preserve">   Chimney to reconstruct AXI, and performs the access on a local AXI RAM bank.</w:t>
+        <w:t xml:space="preserve">   Chimney to reconstruct AXI, decodes the address, and performs the access on</w:t>
+      </w:r>
+    </w:p>
+    <w:p>
+      <w:pPr>
+        <w:pStyle w:val="Code"/>
+      </w:pPr>
+      <w:r>
+        <w:rPr>
+          <w:rFonts w:ascii="Courier New" w:hAnsi="Courier New"/>
+          <w:sz w:val="18"/>
+        </w:rPr>
+        <w:t xml:space="preserve">   a local memory-mapped AXI slave region.</w:t>
       </w:r>
     </w:p>
     <w:p>
@@ -741,70 +741,58 @@
         <w:pStyle w:val="Heading1"/>
       </w:pPr>
       <w:r>
-        <w:t xml:space="preserve">Remote RAM Bank Map</w:t>
-      </w:r>
-    </w:p>
-    <w:p>
-      <w:r>
-        <w:t xml:space="preserve"/>
-      </w:r>
-    </w:p>
-    <w:p>
-      <w:r>
-        <w:t xml:space="preserve">The current endpoint contains four independent RAM banks. Each bank has 256 words, and each word is 32 bits.</w:t>
-      </w:r>
-    </w:p>
-    <w:p>
-      <w:r>
-        <w:t xml:space="preserve"/>
-      </w:r>
-    </w:p>
-    <w:p>
-      <w:pPr>
-        <w:pStyle w:val="Code"/>
-      </w:pPr>
-      <w:r>
-        <w:rPr>
-          <w:rFonts w:ascii="Courier New" w:hAnsi="Courier New"/>
-          <w:sz w:val="18"/>
-        </w:rPr>
-        <w:t xml:space="preserve">RAM bank 0 -&gt; 0x0010_0000 .. 0x0010_03ff</w:t>
-      </w:r>
-    </w:p>
-    <w:p>
-      <w:pPr>
-        <w:pStyle w:val="Code"/>
-      </w:pPr>
-      <w:r>
-        <w:rPr>
-          <w:rFonts w:ascii="Courier New" w:hAnsi="Courier New"/>
-          <w:sz w:val="18"/>
-        </w:rPr>
-        <w:t xml:space="preserve">RAM bank 1 -&gt; 0x0010_0400 .. 0x0010_07ff</w:t>
-      </w:r>
-    </w:p>
-    <w:p>
-      <w:pPr>
-        <w:pStyle w:val="Code"/>
-      </w:pPr>
-      <w:r>
-        <w:rPr>
-          <w:rFonts w:ascii="Courier New" w:hAnsi="Courier New"/>
-          <w:sz w:val="18"/>
-        </w:rPr>
-        <w:t xml:space="preserve">RAM bank 2 -&gt; 0x0010_0800 .. 0x0010_0bff</w:t>
-      </w:r>
-    </w:p>
-    <w:p>
-      <w:pPr>
-        <w:pStyle w:val="Code"/>
-      </w:pPr>
-      <w:r>
-        <w:rPr>
-          <w:rFonts w:ascii="Courier New" w:hAnsi="Courier New"/>
-          <w:sz w:val="18"/>
-        </w:rPr>
-        <w:t xml:space="preserve">RAM bank 3 -&gt; 0x0010_0c00 .. 0x0010_0fff</w:t>
+        <w:t xml:space="preserve">Remote AXI Slave Memory Map</w:t>
+      </w:r>
+    </w:p>
+    <w:p>
+      <w:r>
+        <w:t xml:space="preserve"/>
+      </w:r>
+    </w:p>
+    <w:p>
+      <w:r>
+        <w:t xml:space="preserve">The current endpoint contains three different AXI slave regions:</w:t>
+      </w:r>
+    </w:p>
+    <w:p>
+      <w:r>
+        <w:t xml:space="preserve"/>
+      </w:r>
+    </w:p>
+    <w:p>
+      <w:pPr>
+        <w:pStyle w:val="Code"/>
+      </w:pPr>
+      <w:r>
+        <w:rPr>
+          <w:rFonts w:ascii="Courier New" w:hAnsi="Courier New"/>
+          <w:sz w:val="18"/>
+        </w:rPr>
+        <w:t xml:space="preserve">target 0: small fast register file, 16 x 32-bit  -&gt; 0x0010_0000 .. 0x0010_00ff</w:t>
+      </w:r>
+    </w:p>
+    <w:p>
+      <w:pPr>
+        <w:pStyle w:val="Code"/>
+      </w:pPr>
+      <w:r>
+        <w:rPr>
+          <w:rFonts w:ascii="Courier New" w:hAnsi="Courier New"/>
+          <w:sz w:val="18"/>
+        </w:rPr>
+        <w:t xml:space="preserve">target 1: medium RAM,              256 x 32-bit -&gt; 0x0010_1000 .. 0x0010_13ff</w:t>
+      </w:r>
+    </w:p>
+    <w:p>
+      <w:pPr>
+        <w:pStyle w:val="Code"/>
+      </w:pPr>
+      <w:r>
+        <w:rPr>
+          <w:rFonts w:ascii="Courier New" w:hAnsi="Courier New"/>
+          <w:sz w:val="18"/>
+        </w:rPr>
+        <w:t xml:space="preserve">target 2: large RAM,              1024 x 32-bit -&gt; 0x0010_2000 .. 0x0010_2fff</w:t>
       </w:r>
     </w:p>
     <w:p>
@@ -843,19 +831,43 @@
           <w:rFonts w:ascii="Courier New" w:hAnsi="Courier New"/>
           <w:sz w:val="18"/>
         </w:rPr>
-        <w:t xml:space="preserve">address[11:10] -&gt; selects RAM bank 0..3</w:t>
-      </w:r>
-    </w:p>
-    <w:p>
-      <w:pPr>
-        <w:pStyle w:val="Code"/>
-      </w:pPr>
-      <w:r>
-        <w:rPr>
-          <w:rFonts w:ascii="Courier New" w:hAnsi="Courier New"/>
-          <w:sz w:val="18"/>
-        </w:rPr>
-        <w:t xml:space="preserve">address[9:2]   -&gt; selects word 0..255 inside that RAM bank</w:t>
+        <w:t xml:space="preserve">address[13:12] -&gt; selects target 0..2</w:t>
+      </w:r>
+    </w:p>
+    <w:p>
+      <w:pPr>
+        <w:pStyle w:val="Code"/>
+      </w:pPr>
+      <w:r>
+        <w:rPr>
+          <w:rFonts w:ascii="Courier New" w:hAnsi="Courier New"/>
+          <w:sz w:val="18"/>
+        </w:rPr>
+        <w:t xml:space="preserve">address[5:2]   -&gt; word inside small register file</w:t>
+      </w:r>
+    </w:p>
+    <w:p>
+      <w:pPr>
+        <w:pStyle w:val="Code"/>
+      </w:pPr>
+      <w:r>
+        <w:rPr>
+          <w:rFonts w:ascii="Courier New" w:hAnsi="Courier New"/>
+          <w:sz w:val="18"/>
+        </w:rPr>
+        <w:t xml:space="preserve">address[9:2]   -&gt; word inside medium RAM</w:t>
+      </w:r>
+    </w:p>
+    <w:p>
+      <w:pPr>
+        <w:pStyle w:val="Code"/>
+      </w:pPr>
+      <w:r>
+        <w:rPr>
+          <w:rFonts w:ascii="Courier New" w:hAnsi="Courier New"/>
+          <w:sz w:val="18"/>
+        </w:rPr>
+        <w:t xml:space="preserve">address[11:2]  -&gt; word inside large RAM</w:t>
       </w:r>
     </w:p>
     <w:p>
@@ -894,43 +906,31 @@
           <w:rFonts w:ascii="Courier New" w:hAnsi="Courier New"/>
           <w:sz w:val="18"/>
         </w:rPr>
-        <w:t xml:space="preserve">0x0010_0840 = bank 2, word 16</w:t>
-      </w:r>
-    </w:p>
-    <w:p>
-      <w:pPr>
-        <w:pStyle w:val="Code"/>
-      </w:pPr>
-      <w:r>
-        <w:rPr>
-          <w:rFonts w:ascii="Courier New" w:hAnsi="Courier New"/>
-          <w:sz w:val="18"/>
-        </w:rPr>
-        <w:t xml:space="preserve">0x0010_0844 = bank 2, word 17</w:t>
-      </w:r>
-    </w:p>
-    <w:p>
-      <w:pPr>
-        <w:pStyle w:val="Code"/>
-      </w:pPr>
-      <w:r>
-        <w:rPr>
-          <w:rFonts w:ascii="Courier New" w:hAnsi="Courier New"/>
-          <w:sz w:val="18"/>
-        </w:rPr>
-        <w:t xml:space="preserve">0x0010_0848 = bank 2, word 18</w:t>
-      </w:r>
-    </w:p>
-    <w:p>
-      <w:pPr>
-        <w:pStyle w:val="Code"/>
-      </w:pPr>
-      <w:r>
-        <w:rPr>
-          <w:rFonts w:ascii="Courier New" w:hAnsi="Courier New"/>
-          <w:sz w:val="18"/>
-        </w:rPr>
-        <w:t xml:space="preserve">0x0010_084c = bank 2, word 19</w:t>
+        <w:t xml:space="preserve">0x0010_0000 = small_reg, word 0</w:t>
+      </w:r>
+    </w:p>
+    <w:p>
+      <w:pPr>
+        <w:pStyle w:val="Code"/>
+      </w:pPr>
+      <w:r>
+        <w:rPr>
+          <w:rFonts w:ascii="Courier New" w:hAnsi="Courier New"/>
+          <w:sz w:val="18"/>
+        </w:rPr>
+        <w:t xml:space="preserve">0x0010_1040 = medium_ram, word 16</w:t>
+      </w:r>
+    </w:p>
+    <w:p>
+      <w:pPr>
+        <w:pStyle w:val="Code"/>
+      </w:pPr>
+      <w:r>
+        <w:rPr>
+          <w:rFonts w:ascii="Courier New" w:hAnsi="Courier New"/>
+          <w:sz w:val="18"/>
+        </w:rPr>
+        <w:t xml:space="preserve">0x0010_2400 = large_ram, word 256</w:t>
       </w:r>
     </w:p>
     <w:p>
@@ -1006,7 +1006,7 @@
           <w:rFonts w:ascii="Courier New" w:hAnsi="Courier New"/>
           <w:sz w:val="18"/>
         </w:rPr>
-        <w:t xml:space="preserve">git checkout hamsa-2x2-full-integration</w:t>
+        <w:t xml:space="preserve">git checkout hamsa-separate-remote-endpoints</w:t>
       </w:r>
     </w:p>
     <w:p>
@@ -1030,61 +1030,88 @@
           <w:rFonts w:ascii="Courier New" w:hAnsi="Courier New"/>
           <w:sz w:val="18"/>
         </w:rPr>
-        <w:t xml:space="preserve">git reset --hard origin/hamsa-2x2-full-integration</w:t>
-      </w:r>
-    </w:p>
-    <w:p>
-      <w:r>
-        <w:t xml:space="preserve"/>
-      </w:r>
-    </w:p>
-    <w:p>
-      <w:r>
-        <w:t xml:space="preserve">Default proof, RAM bank 0, words 0..3:</w:t>
-      </w:r>
-    </w:p>
-    <w:p>
-      <w:r>
-        <w:t xml:space="preserve"/>
-      </w:r>
-    </w:p>
-    <w:p>
-      <w:pPr>
-        <w:pStyle w:val="Code"/>
-      </w:pPr>
-      <w:r>
-        <w:rPr>
-          <w:rFonts w:ascii="Courier New" w:hAnsi="Courier New"/>
-          <w:sz w:val="18"/>
-        </w:rPr>
-        <w:t xml:space="preserve">ddp23_make APP=helloworld run REBUILD=true PROBE=true XRUN_FLAGS="+FLOO_SIM_TIMEOUT_S=60"</w:t>
-      </w:r>
-    </w:p>
-    <w:p>
-      <w:r>
-        <w:t xml:space="preserve"/>
-      </w:r>
-    </w:p>
-    <w:p>
-      <w:r>
-        <w:t xml:space="preserve">Selectable RAM proof, RAM bank 2, words 16..19:</w:t>
-      </w:r>
-    </w:p>
-    <w:p>
-      <w:r>
-        <w:t xml:space="preserve"/>
-      </w:r>
-    </w:p>
-    <w:p>
-      <w:pPr>
-        <w:pStyle w:val="Code"/>
-      </w:pPr>
-      <w:r>
-        <w:rPr>
-          <w:rFonts w:ascii="Courier New" w:hAnsi="Courier New"/>
-          <w:sz w:val="18"/>
-        </w:rPr>
-        <w:t xml:space="preserve">ddp23_make APP=helloworld run REBUILD=true PROBE=true XRUN_FLAGS="+FLOO_SIM_TIMEOUT_S=60 +FLOO_REMOTE_BANK=2 +FLOO_REMOTE_IDX=16 +FLOO_REMOTE_WORDS=4 +FLOO_REMOTE_DATA=ABCD2000"</w:t>
+        <w:t xml:space="preserve">git reset --hard origin/hamsa-separate-remote-endpoints</w:t>
+      </w:r>
+    </w:p>
+    <w:p>
+      <w:r>
+        <w:t xml:space="preserve"/>
+      </w:r>
+    </w:p>
+    <w:p>
+      <w:r>
+        <w:t xml:space="preserve">Small register-file target, words 0..3:</w:t>
+      </w:r>
+    </w:p>
+    <w:p>
+      <w:r>
+        <w:t xml:space="preserve"/>
+      </w:r>
+    </w:p>
+    <w:p>
+      <w:pPr>
+        <w:pStyle w:val="Code"/>
+      </w:pPr>
+      <w:r>
+        <w:rPr>
+          <w:rFonts w:ascii="Courier New" w:hAnsi="Courier New"/>
+          <w:sz w:val="18"/>
+        </w:rPr>
+        <w:t xml:space="preserve">ddp23_make APP=helloworld run REBUILD=true PROBE=true XRUN_FLAGS="+FLOO_SIM_TIMEOUT_S=60 +FLOO_REMOTE_TARGET=0 +FLOO_REMOTE_IDX=0 +FLOO_REMOTE_WORDS=4 +FLOO_REMOTE_DATA=A0000000"</w:t>
+      </w:r>
+    </w:p>
+    <w:p>
+      <w:r>
+        <w:t xml:space="preserve"/>
+      </w:r>
+    </w:p>
+    <w:p>
+      <w:r>
+        <w:t xml:space="preserve">Medium RAM target, words 16..19:</w:t>
+      </w:r>
+    </w:p>
+    <w:p>
+      <w:r>
+        <w:t xml:space="preserve"/>
+      </w:r>
+    </w:p>
+    <w:p>
+      <w:pPr>
+        <w:pStyle w:val="Code"/>
+      </w:pPr>
+      <w:r>
+        <w:rPr>
+          <w:rFonts w:ascii="Courier New" w:hAnsi="Courier New"/>
+          <w:sz w:val="18"/>
+        </w:rPr>
+        <w:t xml:space="preserve">ddp23_make APP=helloworld run REBUILD=true PROBE=true XRUN_FLAGS="+FLOO_SIM_TIMEOUT_S=60 +FLOO_REMOTE_TARGET=1 +FLOO_REMOTE_IDX=16 +FLOO_REMOTE_WORDS=4 +FLOO_REMOTE_DATA=B0001000"</w:t>
+      </w:r>
+    </w:p>
+    <w:p>
+      <w:r>
+        <w:t xml:space="preserve"/>
+      </w:r>
+    </w:p>
+    <w:p>
+      <w:r>
+        <w:t xml:space="preserve">Large RAM target, words 256..259:</w:t>
+      </w:r>
+    </w:p>
+    <w:p>
+      <w:r>
+        <w:t xml:space="preserve"/>
+      </w:r>
+    </w:p>
+    <w:p>
+      <w:pPr>
+        <w:pStyle w:val="Code"/>
+      </w:pPr>
+      <w:r>
+        <w:rPr>
+          <w:rFonts w:ascii="Courier New" w:hAnsi="Courier New"/>
+          <w:sz w:val="18"/>
+        </w:rPr>
+        <w:t xml:space="preserve">ddp23_make APP=helloworld run REBUILD=true PROBE=true XRUN_FLAGS="+FLOO_SIM_TIMEOUT_S=60 +FLOO_REMOTE_TARGET=2 +FLOO_REMOTE_IDX=256 +FLOO_REMOTE_WORDS=4 +FLOO_REMOTE_DATA=C0002000"</w:t>
       </w:r>
     </w:p>
     <w:p>
@@ -1111,7 +1138,7 @@
           <w:rFonts w:ascii="Courier New" w:hAnsi="Courier New"/>
           <w:sz w:val="18"/>
         </w:rPr>
-        <w:t xml:space="preserve">grep -E '\*E|FLOO_BUILD|FLOO_2X2|FLOO_STIM|FLOO_MON|TIMEOUT|Hey|FINISH|PASS|FAIL|latency_cycles|bank=' helloworld/xrun.log</w:t>
+        <w:t xml:space="preserve">grep -E '\*E|FLOO_BUILD|FLOO_2X2|FLOO_STIM|FLOO_MON|TIMEOUT|Hey|FINISH|PASS|FAIL|latency_cycles|target=|slave=' helloworld/xrun.log</w:t>
       </w:r>
     </w:p>
     <w:p>
@@ -1141,19 +1168,19 @@
           <w:rFonts w:ascii="Courier New" w:hAnsi="Courier New"/>
           <w:sz w:val="18"/>
         </w:rPr>
-        <w:t xml:space="preserve">FLOO_REMOTE_BANK  = RAM bank to access, 0..3</w:t>
-      </w:r>
-    </w:p>
-    <w:p>
-      <w:pPr>
-        <w:pStyle w:val="Code"/>
-      </w:pPr>
-      <w:r>
-        <w:rPr>
-          <w:rFonts w:ascii="Courier New" w:hAnsi="Courier New"/>
-          <w:sz w:val="18"/>
-        </w:rPr>
-        <w:t xml:space="preserve">FLOO_REMOTE_IDX   = first word inside that RAM bank, 0..255</w:t>
+        <w:t xml:space="preserve">FLOO_REMOTE_TARGET = slave region to access: 0=small_reg, 1=medium_ram, 2=large_ram</w:t>
+      </w:r>
+    </w:p>
+    <w:p>
+      <w:pPr>
+        <w:pStyle w:val="Code"/>
+      </w:pPr>
+      <w:r>
+        <w:rPr>
+          <w:rFonts w:ascii="Courier New" w:hAnsi="Courier New"/>
+          <w:sz w:val="18"/>
+        </w:rPr>
+        <w:t xml:space="preserve">FLOO_REMOTE_IDX    = first word inside that target</w:t>
       </w:r>
     </w:p>
     <w:p>
@@ -1204,7 +1231,7 @@
           <w:rFonts w:ascii="Courier New" w:hAnsi="Courier New"/>
           <w:sz w:val="18"/>
         </w:rPr>
-        <w:t xml:space="preserve">+FLOO_REMOTE_BANK=2 +FLOO_REMOTE_IDX=16 +FLOO_REMOTE_WORDS=4 +FLOO_REMOTE_DATA=ABCD2000</w:t>
+        <w:t xml:space="preserve">+FLOO_REMOTE_TARGET=2 +FLOO_REMOTE_IDX=256 +FLOO_REMOTE_WORDS=4 +FLOO_REMOTE_DATA=C0002000</w:t>
       </w:r>
     </w:p>
     <w:p>
@@ -1231,43 +1258,43 @@
           <w:rFonts w:ascii="Courier New" w:hAnsi="Courier New"/>
           <w:sz w:val="18"/>
         </w:rPr>
-        <w:t xml:space="preserve">bank 2 word 16 -&gt; 0xabcd2000</w:t>
-      </w:r>
-    </w:p>
-    <w:p>
-      <w:pPr>
-        <w:pStyle w:val="Code"/>
-      </w:pPr>
-      <w:r>
-        <w:rPr>
-          <w:rFonts w:ascii="Courier New" w:hAnsi="Courier New"/>
-          <w:sz w:val="18"/>
-        </w:rPr>
-        <w:t xml:space="preserve">bank 2 word 17 -&gt; 0xabcd2001</w:t>
-      </w:r>
-    </w:p>
-    <w:p>
-      <w:pPr>
-        <w:pStyle w:val="Code"/>
-      </w:pPr>
-      <w:r>
-        <w:rPr>
-          <w:rFonts w:ascii="Courier New" w:hAnsi="Courier New"/>
-          <w:sz w:val="18"/>
-        </w:rPr>
-        <w:t xml:space="preserve">bank 2 word 18 -&gt; 0xabcd2002</w:t>
-      </w:r>
-    </w:p>
-    <w:p>
-      <w:pPr>
-        <w:pStyle w:val="Code"/>
-      </w:pPr>
-      <w:r>
-        <w:rPr>
-          <w:rFonts w:ascii="Courier New" w:hAnsi="Courier New"/>
-          <w:sz w:val="18"/>
-        </w:rPr>
-        <w:t xml:space="preserve">bank 2 word 19 -&gt; 0xabcd2003</w:t>
+        <w:t xml:space="preserve">large_ram word 256 -&gt; 0xc0002000</w:t>
+      </w:r>
+    </w:p>
+    <w:p>
+      <w:pPr>
+        <w:pStyle w:val="Code"/>
+      </w:pPr>
+      <w:r>
+        <w:rPr>
+          <w:rFonts w:ascii="Courier New" w:hAnsi="Courier New"/>
+          <w:sz w:val="18"/>
+        </w:rPr>
+        <w:t xml:space="preserve">large_ram word 257 -&gt; 0xc0002001</w:t>
+      </w:r>
+    </w:p>
+    <w:p>
+      <w:pPr>
+        <w:pStyle w:val="Code"/>
+      </w:pPr>
+      <w:r>
+        <w:rPr>
+          <w:rFonts w:ascii="Courier New" w:hAnsi="Courier New"/>
+          <w:sz w:val="18"/>
+        </w:rPr>
+        <w:t xml:space="preserve">large_ram word 258 -&gt; 0xc0002002</w:t>
+      </w:r>
+    </w:p>
+    <w:p>
+      <w:pPr>
+        <w:pStyle w:val="Code"/>
+      </w:pPr>
+      <w:r>
+        <w:rPr>
+          <w:rFonts w:ascii="Courier New" w:hAnsi="Courier New"/>
+          <w:sz w:val="18"/>
+        </w:rPr>
+        <w:t xml:space="preserve">large_ram word 259 -&gt; 0xc0002003</w:t>
       </w:r>
     </w:p>
     <w:p>
@@ -1280,82 +1307,82 @@
         <w:pStyle w:val="Heading1"/>
       </w:pPr>
       <w:r>
-        <w:t xml:space="preserve">Proof From Passing Run</w:t>
-      </w:r>
-    </w:p>
-    <w:p>
-      <w:r>
-        <w:t xml:space="preserve"/>
-      </w:r>
-    </w:p>
-    <w:p>
-      <w:r>
-        <w:t xml:space="preserve">The passing run targeted bank 2, words 16..19:</w:t>
-      </w:r>
-    </w:p>
-    <w:p>
-      <w:r>
-        <w:t xml:space="preserve"/>
-      </w:r>
-    </w:p>
-    <w:p>
-      <w:pPr>
-        <w:pStyle w:val="Code"/>
-      </w:pPr>
-      <w:r>
-        <w:rPr>
-          <w:rFonts w:ascii="Courier New" w:hAnsi="Courier New"/>
-          <w:sz w:val="18"/>
-        </w:rPr>
-        <w:t xml:space="preserve">[FLOO_STIM] remote RAM target base=0x00100000 bank=2 first_word=16 words=4 first_data=0xabcd2000</w:t>
-      </w:r>
-    </w:p>
-    <w:p>
-      <w:pPr>
-        <w:pStyle w:val="Code"/>
-      </w:pPr>
-      <w:r>
-        <w:rPr>
-          <w:rFonts w:ascii="Courier New" w:hAnsi="Courier New"/>
-          <w:sz w:val="18"/>
-        </w:rPr>
-        <w:t xml:space="preserve">[FLOO_2X2] remote AXI RAM AR addr=0x00100840 bank=2 word=16 id=0x7f @ time 54350000</w:t>
-      </w:r>
-    </w:p>
-    <w:p>
-      <w:pPr>
-        <w:pStyle w:val="Code"/>
-      </w:pPr>
-      <w:r>
-        <w:rPr>
-          <w:rFonts w:ascii="Courier New" w:hAnsi="Courier New"/>
-          <w:sz w:val="18"/>
-        </w:rPr>
-        <w:t xml:space="preserve">[FLOO_2X2] remote AXI RAM R response accepted bank=2 word=16 data=0xabcd2000 @ time 54450000</w:t>
-      </w:r>
-    </w:p>
-    <w:p>
-      <w:pPr>
-        <w:pStyle w:val="Code"/>
-      </w:pPr>
-      <w:r>
-        <w:rPr>
-          <w:rFonts w:ascii="Courier New" w:hAnsi="Courier New"/>
-          <w:sz w:val="18"/>
-        </w:rPr>
-        <w:t xml:space="preserve">[FLOO_STIM] read response bank=2 word=16 data=0xabcd2000 latency_cycles=6 @ time 54650000</w:t>
-      </w:r>
-    </w:p>
-    <w:p>
-      <w:pPr>
-        <w:pStyle w:val="Code"/>
-      </w:pPr>
-      <w:r>
-        <w:rPr>
-          <w:rFonts w:ascii="Courier New" w:hAnsi="Courier New"/>
-          <w:sz w:val="18"/>
-        </w:rPr>
-        <w:t xml:space="preserve">[FLOO_2X2] PASS: remote RAM readback bank=2 word=16 data=0xabcd2000</w:t>
+        <w:t xml:space="preserve">Expected Proof From RC Runs</w:t>
+      </w:r>
+    </w:p>
+    <w:p>
+      <w:r>
+        <w:t xml:space="preserve"/>
+      </w:r>
+    </w:p>
+    <w:p>
+      <w:r>
+        <w:t xml:space="preserve">Each target run should show the selected remote slave, the decoded address, four readbacks, and a final pass summary:</w:t>
+      </w:r>
+    </w:p>
+    <w:p>
+      <w:r>
+        <w:t xml:space="preserve"/>
+      </w:r>
+    </w:p>
+    <w:p>
+      <w:pPr>
+        <w:pStyle w:val="Code"/>
+      </w:pPr>
+      <w:r>
+        <w:rPr>
+          <w:rFonts w:ascii="Courier New" w:hAnsi="Courier New"/>
+          <w:sz w:val="18"/>
+        </w:rPr>
+        <w:t xml:space="preserve">[FLOO_STIM] remote target base=0x00100000 target=2 offset=0x00002000 first_word=256 words=4 first_data=0xc0002000</w:t>
+      </w:r>
+    </w:p>
+    <w:p>
+      <w:pPr>
+        <w:pStyle w:val="Code"/>
+      </w:pPr>
+      <w:r>
+        <w:rPr>
+          <w:rFonts w:ascii="Courier New" w:hAnsi="Courier New"/>
+          <w:sz w:val="18"/>
+        </w:rPr>
+        <w:t xml:space="preserve">[FLOO_2X2] remote AXI slave AR addr=0x00102400 slave=large_ram ...</w:t>
+      </w:r>
+    </w:p>
+    <w:p>
+      <w:pPr>
+        <w:pStyle w:val="Code"/>
+      </w:pPr>
+      <w:r>
+        <w:rPr>
+          <w:rFonts w:ascii="Courier New" w:hAnsi="Courier New"/>
+          <w:sz w:val="18"/>
+        </w:rPr>
+        <w:t xml:space="preserve">[FLOO_2X2] remote AXI slave R response accepted slave=large_ram ... data=0xc0002000</w:t>
+      </w:r>
+    </w:p>
+    <w:p>
+      <w:pPr>
+        <w:pStyle w:val="Code"/>
+      </w:pPr>
+      <w:r>
+        <w:rPr>
+          <w:rFonts w:ascii="Courier New" w:hAnsi="Courier New"/>
+          <w:sz w:val="18"/>
+        </w:rPr>
+        <w:t xml:space="preserve">[FLOO_STIM] read response target=2 word=256 data=0xc0002000 latency_cycles=...</w:t>
+      </w:r>
+    </w:p>
+    <w:p>
+      <w:pPr>
+        <w:pStyle w:val="Code"/>
+      </w:pPr>
+      <w:r>
+        <w:rPr>
+          <w:rFonts w:ascii="Courier New" w:hAnsi="Courier New"/>
+          <w:sz w:val="18"/>
+        </w:rPr>
+        <w:t xml:space="preserve">[FLOO_2X2] PASS: remote slave readback target=2 word=256 data=0xc0002000</w:t>
       </w:r>
     </w:p>
     <w:p>
@@ -1379,19 +1406,19 @@
           <w:rFonts w:ascii="Courier New" w:hAnsi="Courier New"/>
           <w:sz w:val="18"/>
         </w:rPr>
-        <w:t xml:space="preserve">[FLOO_2X2] SUMMARY: remote RAM readbacks pass=4 fail=0 total=4</w:t>
-      </w:r>
-    </w:p>
-    <w:p>
-      <w:pPr>
-        <w:pStyle w:val="Code"/>
-      </w:pPr>
-      <w:r>
-        <w:rPr>
-          <w:rFonts w:ascii="Courier New" w:hAnsi="Courier New"/>
-          <w:sz w:val="18"/>
-        </w:rPr>
-        <w:t xml:space="preserve">[FLOO_2X2] PASS: 4/4 remote RAM readbacks matched</w:t>
+        <w:t xml:space="preserve">[FLOO_2X2] SUMMARY: remote slave readbacks pass=4 fail=0 total=4</w:t>
+      </w:r>
+    </w:p>
+    <w:p>
+      <w:pPr>
+        <w:pStyle w:val="Code"/>
+      </w:pPr>
+      <w:r>
+        <w:rPr>
+          <w:rFonts w:ascii="Courier New" w:hAnsi="Courier New"/>
+          <w:sz w:val="18"/>
+        </w:rPr>
+        <w:t xml:space="preserve">[FLOO_2X2] PASS: 4/4 remote slave readbacks matched</w:t>
       </w:r>
     </w:p>
     <w:p>
@@ -1455,29 +1482,29 @@
           <w:rFonts w:ascii="Courier New" w:hAnsi="Courier New"/>
           <w:sz w:val="18"/>
         </w:rPr>
-        <w:t xml:space="preserve">[FLOO_STIM] write response bank=... word=... latency_cycles=...</w:t>
-      </w:r>
-    </w:p>
-    <w:p>
-      <w:pPr>
-        <w:pStyle w:val="Code"/>
-      </w:pPr>
-      <w:r>
-        <w:rPr>
-          <w:rFonts w:ascii="Courier New" w:hAnsi="Courier New"/>
-          <w:sz w:val="18"/>
-        </w:rPr>
-        <w:t xml:space="preserve">[FLOO_STIM] read response bank=... word=... data=... latency_cycles=...</w:t>
-      </w:r>
-    </w:p>
-    <w:p>
-      <w:r>
-        <w:t xml:space="preserve"/>
-      </w:r>
-    </w:p>
-    <w:p>
-      <w:r>
-        <w:t xml:space="preserve">In the passing bank-2 run:</w:t>
+        <w:t xml:space="preserve">[FLOO_STIM] write response target=... word=... latency_cycles=...</w:t>
+      </w:r>
+    </w:p>
+    <w:p>
+      <w:pPr>
+        <w:pStyle w:val="Code"/>
+      </w:pPr>
+      <w:r>
+        <w:rPr>
+          <w:rFonts w:ascii="Courier New" w:hAnsi="Courier New"/>
+          <w:sz w:val="18"/>
+        </w:rPr>
+        <w:t xml:space="preserve">[FLOO_STIM] read response target=... word=... data=... latency_cycles=...</w:t>
+      </w:r>
+    </w:p>
+    <w:p>
+      <w:r>
+        <w:t xml:space="preserve"/>
+      </w:r>
+    </w:p>
+    <w:p>
+      <w:r>
+        <w:t xml:space="preserve">In the previous passing baseline:</w:t>
       </w:r>
     </w:p>
     <w:p>
@@ -1593,19 +1620,19 @@
           <w:rFonts w:ascii="Courier New" w:hAnsi="Courier New"/>
           <w:sz w:val="18"/>
         </w:rPr>
-        <w:t xml:space="preserve">4 writes + 4 reads to consecutive words in a selected RAM bank</w:t>
-      </w:r>
-    </w:p>
-    <w:p>
-      <w:pPr>
-        <w:pStyle w:val="Code"/>
-      </w:pPr>
-      <w:r>
-        <w:rPr>
-          <w:rFonts w:ascii="Courier New" w:hAnsi="Courier New"/>
-          <w:sz w:val="18"/>
-        </w:rPr>
-        <w:t xml:space="preserve">bank selection + word selection + unique data per word</w:t>
+        <w:t xml:space="preserve">4 writes + 4 reads to consecutive words in a selected remote slave region</w:t>
+      </w:r>
+    </w:p>
+    <w:p>
+      <w:pPr>
+        <w:pStyle w:val="Code"/>
+      </w:pPr>
+      <w:r>
+        <w:rPr>
+          <w:rFonts w:ascii="Courier New" w:hAnsi="Courier New"/>
+          <w:sz w:val="18"/>
+        </w:rPr>
+        <w:t xml:space="preserve">target selection + word selection + unique data per word</w:t>
       </w:r>
     </w:p>
     <w:p>
@@ -1707,7 +1734,7 @@
         <w:pStyle w:val="ListParagraph"/>
       </w:pPr>
       <w:r>
-        <w:t xml:space="preserve">The remote AXI RAM bank stores different data values at different addresses.</w:t>
+        <w:t xml:space="preserve">Different remote AXI slave regions store different data values at different addresses.</w:t>
       </w:r>
     </w:p>
     <w:p>
@@ -1723,7 +1750,7 @@
         <w:pStyle w:val="ListParagraph"/>
       </w:pPr>
       <w:r>
-        <w:t xml:space="preserve">The testbench can select different RAM banks and addresses without RTL edits.</w:t>
+        <w:t xml:space="preserve">The testbench can select different remote slaves and addresses without RTL edits.</w:t>
       </w:r>
     </w:p>
     <w:p>
@@ -1746,7 +1773,7 @@
     </w:p>
     <w:p>
       <w:r>
-        <w:t xml:space="preserve">The demo does not yet instantiate four physically separate NoC tiles, each with a separate router coordinate. Instead, it implements four independent RAM banks behind one remote NoC endpoint. This is a good final-project tradeoff: it demonstrates address-based remote memory selection through the integrated NoC path while avoiding the risk of a late topology expansion.</w:t>
+        <w:t xml:space="preserve">The demo does not yet instantiate multiple physically separate NoC tiles, each with a separate router coordinate. Instead, it implements multiple separate AXI slave regions behind one remote NoC endpoint. This is a good final-project tradeoff: it demonstrates realistic memory-mapped remote slave selection through the integrated NoC path while avoiding the risk of a late topology expansion.</w:t>
       </w:r>
     </w:p>
     <w:p>
@@ -1858,43 +1885,55 @@
           <w:rFonts w:ascii="Courier New" w:hAnsi="Courier New"/>
           <w:sz w:val="18"/>
         </w:rPr>
-        <w:t xml:space="preserve">fpgnix_tb.i_hamsa_floo_remote_mem_endpoint.remote_aw_bank_q</w:t>
-      </w:r>
-    </w:p>
-    <w:p>
-      <w:pPr>
-        <w:pStyle w:val="Code"/>
-      </w:pPr>
-      <w:r>
-        <w:rPr>
-          <w:rFonts w:ascii="Courier New" w:hAnsi="Courier New"/>
-          <w:sz w:val="18"/>
-        </w:rPr>
-        <w:t xml:space="preserve">fpgnix_tb.i_hamsa_floo_remote_mem_endpoint.remote_ar_bank_q</w:t>
-      </w:r>
-    </w:p>
-    <w:p>
-      <w:pPr>
-        <w:pStyle w:val="Code"/>
-      </w:pPr>
-      <w:r>
-        <w:rPr>
-          <w:rFonts w:ascii="Courier New" w:hAnsi="Courier New"/>
-          <w:sz w:val="18"/>
-        </w:rPr>
-        <w:t xml:space="preserve">fpgnix_tb.i_hamsa_floo_remote_mem_endpoint.remote_aw_idx_q</w:t>
-      </w:r>
-    </w:p>
-    <w:p>
-      <w:pPr>
-        <w:pStyle w:val="Code"/>
-      </w:pPr>
-      <w:r>
-        <w:rPr>
-          <w:rFonts w:ascii="Courier New" w:hAnsi="Courier New"/>
-          <w:sz w:val="18"/>
-        </w:rPr>
-        <w:t xml:space="preserve">fpgnix_tb.i_hamsa_floo_remote_mem_endpoint.remote_ar_idx_q</w:t>
+        <w:t xml:space="preserve">fpgnix_tb.i_hamsa_floo_remote_mem_endpoint.remote_aw_target_q</w:t>
+      </w:r>
+    </w:p>
+    <w:p>
+      <w:pPr>
+        <w:pStyle w:val="Code"/>
+      </w:pPr>
+      <w:r>
+        <w:rPr>
+          <w:rFonts w:ascii="Courier New" w:hAnsi="Courier New"/>
+          <w:sz w:val="18"/>
+        </w:rPr>
+        <w:t xml:space="preserve">fpgnix_tb.i_hamsa_floo_remote_mem_endpoint.remote_ar_target_q</w:t>
+      </w:r>
+    </w:p>
+    <w:p>
+      <w:pPr>
+        <w:pStyle w:val="Code"/>
+      </w:pPr>
+      <w:r>
+        <w:rPr>
+          <w:rFonts w:ascii="Courier New" w:hAnsi="Courier New"/>
+          <w:sz w:val="18"/>
+        </w:rPr>
+        <w:t xml:space="preserve">fpgnix_tb.i_hamsa_floo_remote_mem_endpoint.remote_aw_small_idx_q</w:t>
+      </w:r>
+    </w:p>
+    <w:p>
+      <w:pPr>
+        <w:pStyle w:val="Code"/>
+      </w:pPr>
+      <w:r>
+        <w:rPr>
+          <w:rFonts w:ascii="Courier New" w:hAnsi="Courier New"/>
+          <w:sz w:val="18"/>
+        </w:rPr>
+        <w:t xml:space="preserve">fpgnix_tb.i_hamsa_floo_remote_mem_endpoint.remote_aw_medium_idx_q</w:t>
+      </w:r>
+    </w:p>
+    <w:p>
+      <w:pPr>
+        <w:pStyle w:val="Code"/>
+      </w:pPr>
+      <w:r>
+        <w:rPr>
+          <w:rFonts w:ascii="Courier New" w:hAnsi="Courier New"/>
+          <w:sz w:val="18"/>
+        </w:rPr>
+        <w:t xml:space="preserve">fpgnix_tb.i_hamsa_floo_remote_mem_endpoint.remote_aw_large_idx_q</w:t>
       </w:r>
     </w:p>
     <w:p>
@@ -1917,7 +1956,7 @@
         <w:pStyle w:val="ListParagraph"/>
       </w:pPr>
       <w:r>
-        <w:t xml:space="preserve">AXI AW/W/B handshake for one write to bank 2.</w:t>
+        <w:t xml:space="preserve">AXI AW/W/B handshake for one write to the selected remote slave.</w:t>
       </w:r>
     </w:p>
     <w:p>
@@ -1933,7 +1972,7 @@
         <w:pStyle w:val="ListParagraph"/>
       </w:pPr>
       <w:r>
-        <w:t xml:space="preserve">Remote endpoint AW/W decode showing bank 2 and word 16.</w:t>
+        <w:t xml:space="preserve">Remote endpoint AW/W decode showing `small_reg`, `medium_ram`, or `large_ram`.</w:t>
       </w:r>
     </w:p>
     <w:p>
@@ -1949,7 +1988,7 @@
         <w:pStyle w:val="ListParagraph"/>
       </w:pPr>
       <w:r>
-        <w:t xml:space="preserve">Final log window showing `PASS: 4/4 remote RAM readbacks matched`.</w:t>
+        <w:t xml:space="preserve">Final log window showing `PASS: 4/4 remote slave readbacks matched`.</w:t>
       </w:r>
     </w:p>
     <w:p>
@@ -1972,7 +2011,7 @@
     </w:p>
     <w:p>
       <w:r>
-        <w:t xml:space="preserve">We integrated FlooNoC into HAMSA by replacing the external/inter-tile AXI path with a Chimney + Router path. The demo drives AXI traffic from HAMSA's `xtrn` port, converts it into Floo flits, sends it to a remote endpoint, converts it back into AXI, and accesses a selectable remote RAM bank. The latest version has four remote RAM banks, each with 256 words. The testbench selects bank 2 and words 16..19, writes unique data values, reads them back, and reports 4/4 matches while HAMSA continues to boot and print `Hey we use floonoc!`.</w:t>
+        <w:t xml:space="preserve">We integrated FlooNoC into HAMSA by replacing the external/inter-tile AXI path with a Chimney + Router path. The demo drives AXI traffic from HAMSA's `xtrn` port, converts it into Floo flits, sends it to a remote endpoint, converts it back into AXI, and accesses a selectable remote AXI slave region. The latest version has a small fast register file, a medium RAM, and a large RAM. The testbench selects a target, writes unique data values to consecutive words, reads them back, and reports 4/4 matches while HAMSA continues to boot and print `Hey we use floonoc!`.</w:t>
       </w:r>
     </w:p>
     <w:sectPr>

</xml_diff>

<commit_message>
docs: update separate slave usage and measurement guide
</commit_message>
<xml_diff>
--- a/docs/floo_2x2_full_integration/HAMSA_FlooNoC_Full_Integration_Report.docx
+++ b/docs/floo_2x2_full_integration/HAMSA_FlooNoC_Full_Integration_Report.docx
@@ -1040,24 +1040,24 @@
     </w:p>
     <w:p>
       <w:r>
-        <w:t xml:space="preserve">Small register-file target, words 0..3:</w:t>
-      </w:r>
-    </w:p>
-    <w:p>
-      <w:r>
-        <w:t xml:space="preserve"/>
-      </w:r>
-    </w:p>
-    <w:p>
-      <w:pPr>
-        <w:pStyle w:val="Code"/>
-      </w:pPr>
-      <w:r>
-        <w:rPr>
-          <w:rFonts w:ascii="Courier New" w:hAnsi="Courier New"/>
-          <w:sz w:val="18"/>
-        </w:rPr>
-        <w:t xml:space="preserve">ddp23_make APP=helloworld run REBUILD=true PROBE=true XRUN_FLAGS="+FLOO_SIM_TIMEOUT_S=60 +FLOO_REMOTE_TARGET=0 +FLOO_REMOTE_IDX=0 +FLOO_REMOTE_WORDS=4 +FLOO_REMOTE_DATA=A0000000"</w:t>
+        <w:t xml:space="preserve">Small register-file target, words 1..4:</w:t>
+      </w:r>
+    </w:p>
+    <w:p>
+      <w:r>
+        <w:t xml:space="preserve"/>
+      </w:r>
+    </w:p>
+    <w:p>
+      <w:pPr>
+        <w:pStyle w:val="Code"/>
+      </w:pPr>
+      <w:r>
+        <w:rPr>
+          <w:rFonts w:ascii="Courier New" w:hAnsi="Courier New"/>
+          <w:sz w:val="18"/>
+        </w:rPr>
+        <w:t xml:space="preserve">ddp23_make APP=helloworld run REBUILD=true PROBE=true XRUN_FLAGS="+FLOO_SIM_TIMEOUT_S=60 +FLOO_REMOTE_TARGET=0 +FLOO_REMOTE_IDX=1 +FLOO_REMOTE_WORDS=4 +FLOO_REMOTE_DATA=A0000001"</w:t>
       </w:r>
     </w:p>
     <w:p>
@@ -1543,7 +1543,58 @@
     </w:p>
     <w:p>
       <w:r>
-        <w:t xml:space="preserve">This is not a full performance benchmark of FlooNoC, because the testbench sends simple single-beat AXI transactions and the remote endpoint is intentionally minimal. It is still useful for report evidence because it shows that the path is not only functionally correct but also measurable.</w:t>
+        <w:t xml:space="preserve">For this report, measure performance by collecting the `latency_cycles` fields for each target run:</w:t>
+      </w:r>
+    </w:p>
+    <w:p>
+      <w:r>
+        <w:t xml:space="preserve"/>
+      </w:r>
+    </w:p>
+    <w:p>
+      <w:pPr>
+        <w:pStyle w:val="Code"/>
+      </w:pPr>
+      <w:r>
+        <w:rPr>
+          <w:rFonts w:ascii="Courier New" w:hAnsi="Courier New"/>
+          <w:sz w:val="18"/>
+        </w:rPr>
+        <w:t xml:space="preserve">target 0: small_reg  write/read latency lines</w:t>
+      </w:r>
+    </w:p>
+    <w:p>
+      <w:pPr>
+        <w:pStyle w:val="Code"/>
+      </w:pPr>
+      <w:r>
+        <w:rPr>
+          <w:rFonts w:ascii="Courier New" w:hAnsi="Courier New"/>
+          <w:sz w:val="18"/>
+        </w:rPr>
+        <w:t xml:space="preserve">target 1: medium_ram write/read latency lines</w:t>
+      </w:r>
+    </w:p>
+    <w:p>
+      <w:pPr>
+        <w:pStyle w:val="Code"/>
+      </w:pPr>
+      <w:r>
+        <w:rPr>
+          <w:rFonts w:ascii="Courier New" w:hAnsi="Courier New"/>
+          <w:sz w:val="18"/>
+        </w:rPr>
+        <w:t xml:space="preserve">target 2: large_ram  write/read latency lines</w:t>
+      </w:r>
+    </w:p>
+    <w:p>
+      <w:r>
+        <w:t xml:space="preserve"/>
+      </w:r>
+    </w:p>
+    <w:p>
+      <w:r>
+        <w:t xml:space="preserve">This is not a full performance benchmark of FlooNoC, because the testbench sends simple single-beat AXI transactions and the remote endpoint is intentionally minimal. It is still useful for report evidence because it shows that the path is not only functionally correct but also measurable. A good report table can list target name, address range, write latency, read latency, and PASS/FAIL result.</w:t>
       </w:r>
     </w:p>
     <w:p>

</xml_diff>